<commit_message>
Worm: Final Boss ReDo
</commit_message>
<xml_diff>
--- a/Five_Day_Lesson_Plan/Assignment & Rubric.docx
+++ b/Five_Day_Lesson_Plan/Assignment & Rubric.docx
@@ -17,12 +17,15 @@
     <w:p>
       <w:pPr>
         <w:spacing w:after="120"/>
+        <w:rPr>
+          <w:szCs w:val="24"/>
+        </w:rPr>
       </w:pPr>
       <w:r>
         <w:rPr>
           <w:b/>
           <w:i/>
-          <w:sz w:val="28"/>
+          <w:szCs w:val="24"/>
         </w:rPr>
         <w:t>The 3-Page Short-Film Screenplay</w:t>
       </w:r>
@@ -30,66 +33,98 @@
     <w:p>
       <w:pPr>
         <w:spacing w:after="120"/>
+        <w:rPr>
+          <w:szCs w:val="24"/>
+        </w:rPr>
       </w:pPr>
       <w:r>
         <w:rPr>
           <w:b/>
+          <w:szCs w:val="24"/>
         </w:rPr>
         <w:t xml:space="preserve">Course: </w:t>
       </w:r>
       <w:r>
+        <w:rPr>
+          <w:szCs w:val="24"/>
+        </w:rPr>
         <w:t>Video Production, Grades 6–8 (Mr. Phil)</w:t>
       </w:r>
     </w:p>
     <w:p>
       <w:pPr>
         <w:spacing w:after="120"/>
+        <w:rPr>
+          <w:szCs w:val="24"/>
+        </w:rPr>
       </w:pPr>
       <w:r>
         <w:rPr>
           <w:b/>
+          <w:szCs w:val="24"/>
         </w:rPr>
         <w:t xml:space="preserve">Assigned: </w:t>
       </w:r>
       <w:r>
+        <w:rPr>
+          <w:szCs w:val="24"/>
+        </w:rPr>
         <w:t>Day 1 — B-Day Monday, May 4, 2026</w:t>
       </w:r>
     </w:p>
     <w:p>
       <w:pPr>
         <w:spacing w:after="120"/>
+        <w:rPr>
+          <w:szCs w:val="24"/>
+        </w:rPr>
       </w:pPr>
       <w:r>
         <w:rPr>
           <w:b/>
+          <w:szCs w:val="24"/>
         </w:rPr>
         <w:t xml:space="preserve">Due: </w:t>
       </w:r>
       <w:r>
+        <w:rPr>
+          <w:szCs w:val="24"/>
+        </w:rPr>
         <w:t>Day 5 — B-Day Thursday, May 14, 2026, in the middle of class (hard-copy + digital upload).</w:t>
       </w:r>
     </w:p>
     <w:p>
       <w:pPr>
         <w:spacing w:after="120"/>
+        <w:rPr>
+          <w:szCs w:val="24"/>
+        </w:rPr>
       </w:pPr>
       <w:r>
         <w:rPr>
           <w:b/>
+          <w:szCs w:val="24"/>
         </w:rPr>
         <w:t xml:space="preserve">Length: </w:t>
       </w:r>
       <w:r>
+        <w:rPr>
+          <w:szCs w:val="24"/>
+        </w:rPr>
         <w:t>Exactly 3 pages in industry-standard screenplay format (≈ 3 minutes of screen time).</w:t>
       </w:r>
     </w:p>
     <w:p>
       <w:pPr>
         <w:spacing w:after="120"/>
+        <w:rPr>
+          <w:szCs w:val="24"/>
+        </w:rPr>
       </w:pPr>
       <w:r>
         <w:rPr>
           <w:b/>
+          <w:szCs w:val="24"/>
           <w:u w:val="single"/>
         </w:rPr>
         <w:t>Purpose</w:t>
@@ -98,25 +133,49 @@
     <w:p>
       <w:pPr>
         <w:spacing w:after="120"/>
-      </w:pPr>
-      <w:r>
+        <w:rPr>
+          <w:szCs w:val="24"/>
+        </w:rPr>
+      </w:pPr>
+      <w:r>
+        <w:rPr>
+          <w:szCs w:val="24"/>
+        </w:rPr>
         <w:t xml:space="preserve">Films are not made from thin air; they are born and developed from a well-planned screenplay. </w:t>
       </w:r>
     </w:p>
     <w:p>
       <w:pPr>
         <w:spacing w:after="120"/>
-      </w:pPr>
-      <w:r>
+        <w:rPr>
+          <w:szCs w:val="24"/>
+        </w:rPr>
+      </w:pPr>
+      <w:r>
+        <w:rPr>
+          <w:szCs w:val="24"/>
+        </w:rPr>
         <w:t xml:space="preserve">You will write the pre-production document that a crew </w:t>
       </w:r>
       <w:proofErr w:type="gramStart"/>
       <w:r>
+        <w:rPr>
+          <w:szCs w:val="24"/>
+        </w:rPr>
         <w:t>actually needs</w:t>
       </w:r>
       <w:proofErr w:type="gramEnd"/>
       <w:r>
-        <w:t xml:space="preserve"> to shoot your short film. You will practice the screenplay genre's three essential “moves” — </w:t>
+        <w:rPr>
+          <w:szCs w:val="24"/>
+        </w:rPr>
+        <w:t xml:space="preserve"> to shoot your short film. You will practice the screenplay genre's three essential “moves”</w:t>
+      </w:r>
+      <w:r>
+        <w:rPr>
+          <w:szCs w:val="24"/>
+        </w:rPr>
+        <w:t>:</w:t>
       </w:r>
     </w:p>
     <w:p>
@@ -125,208 +184,317 @@
         <w:rPr>
           <w:b/>
           <w:bCs/>
+          <w:szCs w:val="24"/>
         </w:rPr>
       </w:pPr>
       <w:r>
         <w:rPr>
           <w:b/>
           <w:bCs/>
-        </w:rPr>
-        <w:t xml:space="preserve">Slugline, </w:t>
+          <w:szCs w:val="24"/>
+        </w:rPr>
+        <w:t>Slugline,</w:t>
       </w:r>
     </w:p>
     <w:p>
       <w:pPr>
         <w:spacing w:after="120"/>
+        <w:rPr>
+          <w:szCs w:val="24"/>
+        </w:rPr>
       </w:pPr>
       <w:r>
         <w:rPr>
           <w:b/>
           <w:bCs/>
+          <w:szCs w:val="24"/>
         </w:rPr>
         <w:t>Action Description</w:t>
       </w:r>
       <w:r>
+        <w:rPr>
+          <w:szCs w:val="24"/>
+        </w:rPr>
         <w:t xml:space="preserve">, </w:t>
       </w:r>
     </w:p>
     <w:p>
       <w:pPr>
         <w:spacing w:after="120"/>
-      </w:pPr>
-      <w:r>
+        <w:rPr>
+          <w:szCs w:val="24"/>
+        </w:rPr>
+      </w:pPr>
+      <w:r>
+        <w:rPr>
+          <w:szCs w:val="24"/>
+        </w:rPr>
         <w:t xml:space="preserve">and </w:t>
       </w:r>
       <w:r>
         <w:rPr>
           <w:b/>
           <w:bCs/>
+          <w:szCs w:val="24"/>
         </w:rPr>
         <w:t>Dialogue</w:t>
       </w:r>
       <w:r>
+        <w:rPr>
+          <w:szCs w:val="24"/>
+        </w:rPr>
         <w:t xml:space="preserve"> — </w:t>
       </w:r>
     </w:p>
     <w:p>
       <w:pPr>
         <w:spacing w:after="120"/>
-      </w:pPr>
-      <w:r>
+        <w:rPr>
+          <w:szCs w:val="24"/>
+        </w:rPr>
+      </w:pPr>
+      <w:r>
+        <w:rPr>
+          <w:szCs w:val="24"/>
+        </w:rPr>
         <w:t xml:space="preserve">While making intentional choices about a Film Genre </w:t>
       </w:r>
     </w:p>
     <w:p>
       <w:pPr>
         <w:spacing w:after="120"/>
-      </w:pPr>
-      <w:r>
+        <w:rPr>
+          <w:szCs w:val="24"/>
+        </w:rPr>
+      </w:pPr>
+      <w:r>
+        <w:rPr>
+          <w:szCs w:val="24"/>
+        </w:rPr>
         <w:t>(</w:t>
       </w:r>
       <w:r>
         <w:rPr>
           <w:b/>
           <w:bCs/>
+          <w:szCs w:val="24"/>
         </w:rPr>
         <w:t>Action</w:t>
       </w:r>
       <w:r>
+        <w:rPr>
+          <w:szCs w:val="24"/>
+        </w:rPr>
         <w:t xml:space="preserve">, </w:t>
       </w:r>
       <w:r>
         <w:rPr>
           <w:b/>
           <w:bCs/>
+          <w:szCs w:val="24"/>
         </w:rPr>
         <w:t>Horror</w:t>
       </w:r>
       <w:r>
+        <w:rPr>
+          <w:szCs w:val="24"/>
+        </w:rPr>
         <w:t xml:space="preserve">, </w:t>
       </w:r>
       <w:r>
         <w:rPr>
           <w:b/>
           <w:bCs/>
+          <w:szCs w:val="24"/>
         </w:rPr>
         <w:t>Romance</w:t>
       </w:r>
       <w:r>
+        <w:rPr>
+          <w:szCs w:val="24"/>
+        </w:rPr>
         <w:t xml:space="preserve">, </w:t>
       </w:r>
       <w:r>
         <w:rPr>
           <w:b/>
           <w:bCs/>
+          <w:szCs w:val="24"/>
         </w:rPr>
         <w:t>Drama</w:t>
       </w:r>
       <w:r>
+        <w:rPr>
+          <w:szCs w:val="24"/>
+        </w:rPr>
         <w:t xml:space="preserve">, or </w:t>
       </w:r>
       <w:r>
         <w:rPr>
           <w:b/>
           <w:bCs/>
+          <w:szCs w:val="24"/>
         </w:rPr>
         <w:t>Comedy</w:t>
       </w:r>
       <w:r>
+        <w:rPr>
+          <w:szCs w:val="24"/>
+        </w:rPr>
         <w:t xml:space="preserve">) </w:t>
       </w:r>
     </w:p>
     <w:p>
       <w:pPr>
         <w:spacing w:after="120"/>
-      </w:pPr>
-      <w:r>
+        <w:rPr>
+          <w:szCs w:val="24"/>
+        </w:rPr>
+      </w:pPr>
+      <w:r>
+        <w:rPr>
+          <w:szCs w:val="24"/>
+        </w:rPr>
         <w:t xml:space="preserve">and one sub-genre technique </w:t>
       </w:r>
     </w:p>
     <w:p>
       <w:pPr>
         <w:spacing w:after="120"/>
-      </w:pPr>
-      <w:r>
+        <w:rPr>
+          <w:szCs w:val="24"/>
+        </w:rPr>
+      </w:pPr>
+      <w:r>
+        <w:rPr>
+          <w:szCs w:val="24"/>
+        </w:rPr>
         <w:t>(</w:t>
       </w:r>
       <w:r>
         <w:rPr>
           <w:b/>
           <w:bCs/>
+          <w:szCs w:val="24"/>
         </w:rPr>
         <w:t>Dream Sequence</w:t>
       </w:r>
       <w:r>
+        <w:rPr>
+          <w:szCs w:val="24"/>
+        </w:rPr>
         <w:t xml:space="preserve">, </w:t>
       </w:r>
       <w:r>
         <w:rPr>
           <w:b/>
           <w:bCs/>
+          <w:szCs w:val="24"/>
         </w:rPr>
         <w:t>Montage</w:t>
       </w:r>
       <w:r>
+        <w:rPr>
+          <w:szCs w:val="24"/>
+        </w:rPr>
         <w:t xml:space="preserve">, or </w:t>
       </w:r>
       <w:r>
         <w:rPr>
           <w:b/>
           <w:bCs/>
+          <w:szCs w:val="24"/>
         </w:rPr>
         <w:t>Graphic Match-Cut</w:t>
       </w:r>
       <w:r>
+        <w:rPr>
+          <w:szCs w:val="24"/>
+        </w:rPr>
         <w:t xml:space="preserve">). </w:t>
       </w:r>
     </w:p>
     <w:p>
       <w:pPr>
         <w:spacing w:after="120"/>
-      </w:pPr>
-      <w:r>
+        <w:rPr>
+          <w:szCs w:val="24"/>
+        </w:rPr>
+      </w:pPr>
+      <w:r>
+        <w:rPr>
+          <w:szCs w:val="24"/>
+        </w:rPr>
         <w:t xml:space="preserve">Your screenplay will be heard aloud </w:t>
       </w:r>
       <w:proofErr w:type="gramStart"/>
       <w:r>
+        <w:rPr>
+          <w:szCs w:val="24"/>
+        </w:rPr>
         <w:t>in</w:t>
       </w:r>
       <w:proofErr w:type="gramEnd"/>
       <w:r>
+        <w:rPr>
+          <w:szCs w:val="24"/>
+        </w:rPr>
         <w:t xml:space="preserve"> a group </w:t>
       </w:r>
       <w:proofErr w:type="gramStart"/>
       <w:r>
+        <w:rPr>
+          <w:szCs w:val="24"/>
+        </w:rPr>
         <w:t>table read</w:t>
       </w:r>
       <w:proofErr w:type="gramEnd"/>
       <w:r>
+        <w:rPr>
+          <w:szCs w:val="24"/>
+        </w:rPr>
         <w:t xml:space="preserve"> before you turn it in, so it is written to be performed, not just read. Think of </w:t>
       </w:r>
       <w:proofErr w:type="gramStart"/>
       <w:r>
+        <w:rPr>
+          <w:szCs w:val="24"/>
+        </w:rPr>
         <w:t>it</w:t>
       </w:r>
       <w:proofErr w:type="gramEnd"/>
       <w:r>
+        <w:rPr>
+          <w:szCs w:val="24"/>
+        </w:rPr>
         <w:t xml:space="preserve"> kind of like a </w:t>
       </w:r>
       <w:proofErr w:type="gramStart"/>
       <w:r>
+        <w:rPr>
+          <w:szCs w:val="24"/>
+        </w:rPr>
         <w:t>mini-play</w:t>
       </w:r>
       <w:proofErr w:type="gramEnd"/>
       <w:r>
+        <w:rPr>
+          <w:szCs w:val="24"/>
+        </w:rPr>
         <w:t xml:space="preserve"> you get to write as you like.</w:t>
       </w:r>
     </w:p>
     <w:p>
       <w:pPr>
         <w:spacing w:after="120"/>
+        <w:rPr>
+          <w:szCs w:val="24"/>
+        </w:rPr>
       </w:pPr>
       <w:r>
         <w:rPr>
           <w:b/>
+          <w:szCs w:val="24"/>
           <w:u w:val="single"/>
         </w:rPr>
         <w:t>What You Will Write</w:t>
@@ -340,8 +508,14 @@
         </w:tabs>
         <w:spacing w:after="40"/>
         <w:ind w:left="360" w:hanging="360"/>
-      </w:pPr>
-      <w:r>
+        <w:rPr>
+          <w:szCs w:val="24"/>
+        </w:rPr>
+      </w:pPr>
+      <w:r>
+        <w:rPr>
+          <w:szCs w:val="24"/>
+        </w:rPr>
         <w:t>A 3-page screenplay in correct format using the Google-Docs “Screenplay” template.</w:t>
       </w:r>
     </w:p>
@@ -353,9 +527,39 @@
         </w:tabs>
         <w:spacing w:after="40"/>
         <w:ind w:left="360" w:hanging="360"/>
-      </w:pPr>
-      <w:r>
-        <w:t>Title page NOT included in the 3-page count.</w:t>
+        <w:rPr>
+          <w:szCs w:val="24"/>
+        </w:rPr>
+      </w:pPr>
+      <w:r>
+        <w:rPr>
+          <w:szCs w:val="24"/>
+        </w:rPr>
+        <w:t xml:space="preserve">Include a </w:t>
+      </w:r>
+      <w:r>
+        <w:rPr>
+          <w:szCs w:val="24"/>
+        </w:rPr>
+        <w:t xml:space="preserve">Title page </w:t>
+      </w:r>
+      <w:r>
+        <w:rPr>
+          <w:szCs w:val="24"/>
+        </w:rPr>
+        <w:t>(</w:t>
+      </w:r>
+      <w:r>
+        <w:rPr>
+          <w:szCs w:val="24"/>
+        </w:rPr>
+        <w:t>NOT included in the 3-page count.</w:t>
+      </w:r>
+      <w:r>
+        <w:rPr>
+          <w:szCs w:val="24"/>
+        </w:rPr>
+        <w:t>)</w:t>
       </w:r>
     </w:p>
     <w:p>
@@ -366,8 +570,14 @@
         </w:tabs>
         <w:spacing w:after="40"/>
         <w:ind w:left="360" w:hanging="360"/>
-      </w:pPr>
-      <w:r>
+        <w:rPr>
+          <w:szCs w:val="24"/>
+        </w:rPr>
+      </w:pPr>
+      <w:r>
+        <w:rPr>
+          <w:szCs w:val="24"/>
+        </w:rPr>
         <w:t>One clearly identifiable Film Genre (your choice of the five we study).</w:t>
       </w:r>
     </w:p>
@@ -379,9 +589,51 @@
         </w:tabs>
         <w:spacing w:after="40"/>
         <w:ind w:left="360" w:hanging="360"/>
-      </w:pPr>
-      <w:r>
-        <w:t>At least ONE correctly formatted sub-genre technique (Dream Sequence OR Montage OR Graphic Match-Cut).</w:t>
+        <w:rPr>
+          <w:szCs w:val="24"/>
+        </w:rPr>
+      </w:pPr>
+      <w:r>
+        <w:rPr>
+          <w:szCs w:val="24"/>
+        </w:rPr>
+        <w:t>MUSTS: Minimum</w:t>
+      </w:r>
+      <w:r>
+        <w:rPr>
+          <w:szCs w:val="24"/>
+        </w:rPr>
+        <w:t xml:space="preserve"> THREE sluglines, TWO </w:t>
+      </w:r>
+      <w:r>
+        <w:rPr>
+          <w:szCs w:val="24"/>
+        </w:rPr>
+        <w:t>blocks of dialog</w:t>
+      </w:r>
+      <w:r>
+        <w:rPr>
+          <w:szCs w:val="24"/>
+        </w:rPr>
+        <w:t xml:space="preserve">, </w:t>
+      </w:r>
+      <w:r>
+        <w:rPr>
+          <w:szCs w:val="24"/>
+        </w:rPr>
+        <w:t xml:space="preserve">ONE </w:t>
+      </w:r>
+      <w:r>
+        <w:rPr>
+          <w:szCs w:val="24"/>
+        </w:rPr>
+        <w:t xml:space="preserve">sub-genre </w:t>
+      </w:r>
+      <w:r>
+        <w:rPr>
+          <w:szCs w:val="24"/>
+        </w:rPr>
+        <w:t>technique</w:t>
       </w:r>
     </w:p>
     <w:p>
@@ -392,9 +644,21 @@
         </w:tabs>
         <w:spacing w:after="40"/>
         <w:ind w:left="360" w:hanging="360"/>
-      </w:pPr>
-      <w:r>
-        <w:t>At least THREE sluglines, at least TWO dialog exchanges, and present-tense action description throughout.</w:t>
+        <w:rPr>
+          <w:szCs w:val="24"/>
+        </w:rPr>
+      </w:pPr>
+      <w:r>
+        <w:rPr>
+          <w:szCs w:val="24"/>
+        </w:rPr>
+        <w:t>P</w:t>
+      </w:r>
+      <w:r>
+        <w:rPr>
+          <w:szCs w:val="24"/>
+        </w:rPr>
+        <w:t>resent-tense action description throughout.</w:t>
       </w:r>
     </w:p>
     <w:p>
@@ -405,36 +669,99 @@
         </w:tabs>
         <w:spacing w:after="40"/>
         <w:ind w:left="360" w:hanging="360"/>
-      </w:pPr>
-      <w:r>
-        <w:t>A clear protagonist with a goal, an obstacle, and some kind of change or turn by the final page.</w:t>
-      </w:r>
+        <w:rPr>
+          <w:szCs w:val="24"/>
+        </w:rPr>
+      </w:pPr>
+      <w:r>
+        <w:rPr>
+          <w:szCs w:val="24"/>
+        </w:rPr>
+        <w:t>A clear protagonist with a goal, an obstacle, and some kind of change or turn by the</w:t>
+      </w:r>
+      <w:r>
+        <w:rPr>
+          <w:szCs w:val="24"/>
+        </w:rPr>
+        <w:t xml:space="preserve"> end</w:t>
+      </w:r>
+    </w:p>
+    <w:p>
+      <w:pPr>
+        <w:pStyle w:val="ListBullet"/>
+        <w:numPr>
+          <w:ilvl w:val="0"/>
+          <w:numId w:val="0"/>
+        </w:numPr>
+        <w:spacing w:after="40"/>
+        <w:rPr>
+          <w:szCs w:val="24"/>
+        </w:rPr>
+      </w:pPr>
+    </w:p>
+    <w:p>
+      <w:pPr>
+        <w:pStyle w:val="ListBullet"/>
+        <w:numPr>
+          <w:ilvl w:val="0"/>
+          <w:numId w:val="0"/>
+        </w:numPr>
+        <w:spacing w:after="40"/>
+        <w:rPr>
+          <w:szCs w:val="24"/>
+        </w:rPr>
+      </w:pPr>
+    </w:p>
+    <w:p>
+      <w:pPr>
+        <w:pStyle w:val="ListBullet"/>
+        <w:numPr>
+          <w:ilvl w:val="0"/>
+          <w:numId w:val="0"/>
+        </w:numPr>
+        <w:spacing w:after="40"/>
+        <w:rPr>
+          <w:szCs w:val="24"/>
+        </w:rPr>
+      </w:pPr>
+    </w:p>
+    <w:p>
+      <w:pPr>
+        <w:pStyle w:val="ListBullet"/>
+        <w:numPr>
+          <w:ilvl w:val="0"/>
+          <w:numId w:val="0"/>
+        </w:numPr>
+        <w:spacing w:after="40"/>
+        <w:rPr>
+          <w:szCs w:val="24"/>
+        </w:rPr>
+      </w:pPr>
+    </w:p>
+    <w:p>
+      <w:pPr>
+        <w:pStyle w:val="ListBullet"/>
+        <w:numPr>
+          <w:ilvl w:val="0"/>
+          <w:numId w:val="0"/>
+        </w:numPr>
+        <w:spacing w:after="40"/>
+        <w:rPr>
+          <w:szCs w:val="24"/>
+        </w:rPr>
+      </w:pPr>
     </w:p>
     <w:p>
       <w:pPr>
         <w:spacing w:after="120"/>
         <w:rPr>
+          <w:szCs w:val="24"/>
+        </w:rPr>
+      </w:pPr>
+      <w:r>
+        <w:rPr>
           <w:b/>
-          <w:u w:val="single"/>
-        </w:rPr>
-      </w:pPr>
-    </w:p>
-    <w:p>
-      <w:pPr>
-        <w:spacing w:after="120"/>
-        <w:rPr>
-          <w:b/>
-          <w:u w:val="single"/>
-        </w:rPr>
-      </w:pPr>
-    </w:p>
-    <w:p>
-      <w:pPr>
-        <w:spacing w:after="120"/>
-      </w:pPr>
-      <w:r>
-        <w:rPr>
-          <w:b/>
+          <w:szCs w:val="24"/>
           <w:u w:val="single"/>
         </w:rPr>
         <w:lastRenderedPageBreak/>
@@ -449,9 +776,15 @@
         </w:tabs>
         <w:spacing w:after="40"/>
         <w:ind w:left="360" w:hanging="360"/>
-      </w:pPr>
-      <w:r>
-        <w:t>Courier / Courier Prime 12 pt (screenplay standard) OR the formatting supplied automatically by Celtx.</w:t>
+        <w:rPr>
+          <w:szCs w:val="24"/>
+        </w:rPr>
+      </w:pPr>
+      <w:r>
+        <w:rPr>
+          <w:szCs w:val="24"/>
+        </w:rPr>
+        <w:t>Courier 12 pt (screenplay standard) OR the formatting supplied automatically by Celtx.</w:t>
       </w:r>
     </w:p>
     <w:p>
@@ -462,8 +795,14 @@
         </w:tabs>
         <w:spacing w:after="40"/>
         <w:ind w:left="360" w:hanging="360"/>
-      </w:pPr>
-      <w:r>
+        <w:rPr>
+          <w:szCs w:val="24"/>
+        </w:rPr>
+      </w:pPr>
+      <w:r>
+        <w:rPr>
+          <w:szCs w:val="24"/>
+        </w:rPr>
         <w:t>1.5″ left margin, 1″ right margin, 1″ top / bottom (screenplay standard).</w:t>
       </w:r>
     </w:p>
@@ -475,8 +814,14 @@
         </w:tabs>
         <w:spacing w:after="40"/>
         <w:ind w:left="360" w:hanging="360"/>
-      </w:pPr>
-      <w:r>
+        <w:rPr>
+          <w:szCs w:val="24"/>
+        </w:rPr>
+      </w:pPr>
+      <w:r>
+        <w:rPr>
+          <w:szCs w:val="24"/>
+        </w:rPr>
         <w:t>Sluglines: INT./EXT. LOCATION — TIME OF DAY, in ALL CAPS.</w:t>
       </w:r>
     </w:p>
@@ -488,8 +833,14 @@
         </w:tabs>
         <w:spacing w:after="40"/>
         <w:ind w:left="360" w:hanging="360"/>
-      </w:pPr>
-      <w:r>
+        <w:rPr>
+          <w:szCs w:val="24"/>
+        </w:rPr>
+      </w:pPr>
+      <w:r>
+        <w:rPr>
+          <w:szCs w:val="24"/>
+        </w:rPr>
         <w:t>Character cues: ALL CAPS, centered.</w:t>
       </w:r>
     </w:p>
@@ -501,8 +852,14 @@
         </w:tabs>
         <w:spacing w:after="40"/>
         <w:ind w:left="360" w:hanging="360"/>
-      </w:pPr>
-      <w:r>
+        <w:rPr>
+          <w:szCs w:val="24"/>
+        </w:rPr>
+      </w:pPr>
+      <w:r>
+        <w:rPr>
+          <w:szCs w:val="24"/>
+        </w:rPr>
         <w:t>Dialog: indented block under the character cue.</w:t>
       </w:r>
     </w:p>
@@ -514,8 +871,14 @@
         </w:tabs>
         <w:spacing w:after="40"/>
         <w:ind w:left="360" w:hanging="360"/>
-      </w:pPr>
-      <w:r>
+        <w:rPr>
+          <w:szCs w:val="24"/>
+        </w:rPr>
+      </w:pPr>
+      <w:r>
+        <w:rPr>
+          <w:szCs w:val="24"/>
+        </w:rPr>
         <w:t>Action lines: left-margin, present tense, describe only what the camera can see.</w:t>
       </w:r>
     </w:p>
@@ -527,9 +890,45 @@
         </w:tabs>
         <w:spacing w:after="40"/>
         <w:ind w:left="360" w:hanging="360"/>
-      </w:pPr>
-      <w:r>
-        <w:t>3 pages exactly — no less, no more.</w:t>
+        <w:rPr>
+          <w:szCs w:val="24"/>
+        </w:rPr>
+      </w:pPr>
+      <w:r>
+        <w:rPr>
+          <w:szCs w:val="24"/>
+        </w:rPr>
+        <w:t>EXACTLY 3 PAGES. N</w:t>
+      </w:r>
+      <w:r>
+        <w:rPr>
+          <w:szCs w:val="24"/>
+        </w:rPr>
+        <w:t xml:space="preserve">o </w:t>
+      </w:r>
+      <w:r>
+        <w:rPr>
+          <w:szCs w:val="24"/>
+        </w:rPr>
+        <w:t>more</w:t>
+      </w:r>
+      <w:r>
+        <w:rPr>
+          <w:szCs w:val="24"/>
+        </w:rPr>
+        <w:t xml:space="preserve">, no </w:t>
+      </w:r>
+      <w:r>
+        <w:rPr>
+          <w:szCs w:val="24"/>
+        </w:rPr>
+        <w:t>less</w:t>
+      </w:r>
+      <w:r>
+        <w:rPr>
+          <w:szCs w:val="24"/>
+        </w:rPr>
+        <w:t>.</w:t>
       </w:r>
     </w:p>
     <w:p>
@@ -541,15 +940,22 @@
         </w:numPr>
         <w:spacing w:after="40"/>
         <w:ind w:left="360"/>
+        <w:rPr>
+          <w:szCs w:val="24"/>
+        </w:rPr>
       </w:pPr>
     </w:p>
     <w:p>
       <w:pPr>
         <w:spacing w:after="120"/>
+        <w:rPr>
+          <w:szCs w:val="24"/>
+        </w:rPr>
       </w:pPr>
       <w:r>
         <w:rPr>
           <w:b/>
+          <w:szCs w:val="24"/>
           <w:u w:val="single"/>
         </w:rPr>
         <w:t>Process (what you will do to get there)</w:t>
@@ -563,12 +969,15 @@
         </w:tabs>
         <w:spacing w:after="40"/>
         <w:ind w:left="360" w:hanging="360"/>
-      </w:pPr>
-      <w:r>
-        <w:t>Day 1 — Exploratory: draft 3 sluglines + opening action paragraph. Define Genre.</w:t>
-      </w:r>
-      <w:r>
-        <w:t xml:space="preserve"> Five-Day</w:t>
+        <w:rPr>
+          <w:szCs w:val="24"/>
+        </w:rPr>
+      </w:pPr>
+      <w:r>
+        <w:rPr>
+          <w:szCs w:val="24"/>
+        </w:rPr>
+        <w:t>Day 1 Exploratory: draft 3 sluglines + opening action paragraph. Define Genre.</w:t>
       </w:r>
     </w:p>
     <w:p>
@@ -579,9 +988,15 @@
         </w:tabs>
         <w:spacing w:after="40"/>
         <w:ind w:left="360" w:hanging="360"/>
-      </w:pPr>
-      <w:r>
-        <w:t>Day 2 — Exploratory: write a 1-page Dream Sequence, practicing action description.</w:t>
+        <w:rPr>
+          <w:szCs w:val="24"/>
+        </w:rPr>
+      </w:pPr>
+      <w:r>
+        <w:rPr>
+          <w:szCs w:val="24"/>
+        </w:rPr>
+        <w:t>Day 2 Exploratory: write a 1-page Dream Sequence, practicing action description.</w:t>
       </w:r>
     </w:p>
     <w:p>
@@ -592,9 +1007,15 @@
         </w:tabs>
         <w:spacing w:after="40"/>
         <w:ind w:left="360" w:hanging="360"/>
-      </w:pPr>
-      <w:r>
-        <w:t>Day 3 — Exploratory: write a 1-page scene built around Dialog + a Montage sequence.</w:t>
+        <w:rPr>
+          <w:szCs w:val="24"/>
+        </w:rPr>
+      </w:pPr>
+      <w:r>
+        <w:rPr>
+          <w:szCs w:val="24"/>
+        </w:rPr>
+        <w:t>Day 3 Exploratory: write a 1-page scene built around Dialog + a Montage sequence.</w:t>
       </w:r>
     </w:p>
     <w:p>
@@ -605,9 +1026,52 @@
         </w:tabs>
         <w:spacing w:after="40"/>
         <w:ind w:left="360" w:hanging="360"/>
-      </w:pPr>
-      <w:r>
-        <w:t>Day 4 — Exploratory: write a 1-page scene that uses a Graphic Match-Cut; then assemble a 3-page draft of your final screenplay.</w:t>
+        <w:rPr>
+          <w:szCs w:val="24"/>
+        </w:rPr>
+      </w:pPr>
+      <w:r>
+        <w:rPr>
+          <w:szCs w:val="24"/>
+        </w:rPr>
+        <w:t xml:space="preserve">Day 4 Exploratory: write a 1-page scene that uses a Graphic Match-Cut; </w:t>
+      </w:r>
+      <w:r>
+        <w:rPr>
+          <w:szCs w:val="24"/>
+        </w:rPr>
+        <w:t>AND</w:t>
+      </w:r>
+      <w:r>
+        <w:rPr>
+          <w:szCs w:val="24"/>
+        </w:rPr>
+        <w:t xml:space="preserve"> assemble a 3-page draft of your screenplay</w:t>
+      </w:r>
+      <w:r>
+        <w:rPr>
+          <w:szCs w:val="24"/>
+        </w:rPr>
+        <w:t xml:space="preserve"> 1</w:t>
+      </w:r>
+      <w:r>
+        <w:rPr>
+          <w:szCs w:val="24"/>
+          <w:vertAlign w:val="superscript"/>
+        </w:rPr>
+        <w:t>st</w:t>
+      </w:r>
+      <w:r>
+        <w:rPr>
+          <w:szCs w:val="24"/>
+        </w:rPr>
+        <w:t xml:space="preserve"> draft</w:t>
+      </w:r>
+      <w:r>
+        <w:rPr>
+          <w:szCs w:val="24"/>
+        </w:rPr>
+        <w:t>.</w:t>
       </w:r>
     </w:p>
     <w:p>
@@ -618,18 +1082,52 @@
         </w:tabs>
         <w:spacing w:after="40"/>
         <w:ind w:left="360" w:hanging="360"/>
-      </w:pPr>
-      <w:r>
-        <w:t>Day 5 — In class: rapid review, in-class revision, hand-in (mid-class), then table reads in small groups.</w:t>
+        <w:rPr>
+          <w:szCs w:val="24"/>
+        </w:rPr>
+      </w:pPr>
+      <w:r>
+        <w:rPr>
+          <w:szCs w:val="24"/>
+        </w:rPr>
+        <w:t>Day 5</w:t>
+      </w:r>
+      <w:r>
+        <w:rPr>
+          <w:szCs w:val="24"/>
+        </w:rPr>
+        <w:t>: In-class</w:t>
+      </w:r>
+      <w:r>
+        <w:rPr>
+          <w:szCs w:val="24"/>
+        </w:rPr>
+        <w:t xml:space="preserve"> revision</w:t>
+      </w:r>
+      <w:r>
+        <w:rPr>
+          <w:szCs w:val="24"/>
+        </w:rPr>
+        <w:t xml:space="preserve"> and review</w:t>
+      </w:r>
+      <w:r>
+        <w:rPr>
+          <w:szCs w:val="24"/>
+        </w:rPr>
+        <w:t>, hand-in (mid-class), then table reads in small groups.</w:t>
       </w:r>
     </w:p>
     <w:p>
       <w:pPr>
         <w:spacing w:after="120"/>
+        <w:rPr>
+          <w:szCs w:val="24"/>
+        </w:rPr>
       </w:pPr>
       <w:r>
         <w:rPr>
           <w:b/>
+          <w:szCs w:val="24"/>
           <w:u w:val="single"/>
         </w:rPr>
         <w:t>Grading</w:t>
@@ -638,13 +1136,39 @@
     <w:p>
       <w:pPr>
         <w:spacing w:after="120"/>
-      </w:pPr>
-      <w:r>
-        <w:t>Graded on the attached 5-criterion, 25-point rubric (Beginning / Developing / Accomplished / Exemplary).</w:t>
-      </w:r>
-    </w:p>
-    <w:p>
-      <w:r>
+        <w:rPr>
+          <w:szCs w:val="24"/>
+        </w:rPr>
+      </w:pPr>
+      <w:r>
+        <w:rPr>
+          <w:szCs w:val="24"/>
+        </w:rPr>
+        <w:t xml:space="preserve">Graded on the attached 5-criterion, </w:t>
+      </w:r>
+      <w:r>
+        <w:rPr>
+          <w:szCs w:val="24"/>
+        </w:rPr>
+        <w:t>100</w:t>
+      </w:r>
+      <w:r>
+        <w:rPr>
+          <w:szCs w:val="24"/>
+        </w:rPr>
+        <w:t>-point rubric</w:t>
+      </w:r>
+    </w:p>
+    <w:p>
+      <w:pPr>
+        <w:rPr>
+          <w:szCs w:val="24"/>
+        </w:rPr>
+      </w:pPr>
+      <w:r>
+        <w:rPr>
+          <w:szCs w:val="24"/>
+        </w:rPr>
         <w:br w:type="page"/>
       </w:r>
     </w:p>
@@ -684,21 +1208,21 @@
     <w:tbl>
       <w:tblPr>
         <w:tblStyle w:val="TableGrid"/>
-        <w:tblW w:w="11700" w:type="dxa"/>
-        <w:tblInd w:w="-1062" w:type="dxa"/>
+        <w:tblW w:w="11903" w:type="dxa"/>
+        <w:tblInd w:w="-1265" w:type="dxa"/>
         <w:tblLook w:val="04A0" w:firstRow="1" w:lastRow="0" w:firstColumn="1" w:lastColumn="0" w:noHBand="0" w:noVBand="1"/>
       </w:tblPr>
       <w:tblGrid>
-        <w:gridCol w:w="2298"/>
-        <w:gridCol w:w="2663"/>
-        <w:gridCol w:w="1879"/>
-        <w:gridCol w:w="2160"/>
-        <w:gridCol w:w="2700"/>
+        <w:gridCol w:w="1561"/>
+        <w:gridCol w:w="2489"/>
+        <w:gridCol w:w="2430"/>
+        <w:gridCol w:w="2430"/>
+        <w:gridCol w:w="2993"/>
       </w:tblGrid>
       <w:tr>
         <w:tc>
           <w:tcPr>
-            <w:tcW w:w="2298" w:type="dxa"/>
+            <w:tcW w:w="1561" w:type="dxa"/>
           </w:tcPr>
           <w:p>
             <w:r>
@@ -712,7 +1236,7 @@
         </w:tc>
         <w:tc>
           <w:tcPr>
-            <w:tcW w:w="2663" w:type="dxa"/>
+            <w:tcW w:w="2489" w:type="dxa"/>
           </w:tcPr>
           <w:p>
             <w:r>
@@ -739,7 +1263,7 @@
         </w:tc>
         <w:tc>
           <w:tcPr>
-            <w:tcW w:w="1879" w:type="dxa"/>
+            <w:tcW w:w="2430" w:type="dxa"/>
           </w:tcPr>
           <w:p>
             <w:proofErr w:type="gramStart"/>
@@ -775,7 +1299,7 @@
         </w:tc>
         <w:tc>
           <w:tcPr>
-            <w:tcW w:w="2160" w:type="dxa"/>
+            <w:tcW w:w="2430" w:type="dxa"/>
           </w:tcPr>
           <w:p>
             <w:r>
@@ -802,7 +1326,7 @@
         </w:tc>
         <w:tc>
           <w:tcPr>
-            <w:tcW w:w="2700" w:type="dxa"/>
+            <w:tcW w:w="2993" w:type="dxa"/>
           </w:tcPr>
           <w:p>
             <w:r>
@@ -824,6 +1348,356 @@
                 <w:sz w:val="24"/>
               </w:rPr>
               <w:t>)</w:t>
+            </w:r>
+          </w:p>
+        </w:tc>
+      </w:tr>
+      <w:tr>
+        <w:trPr>
+          <w:trHeight w:val="1988"/>
+        </w:trPr>
+        <w:tc>
+          <w:tcPr>
+            <w:tcW w:w="1561" w:type="dxa"/>
+          </w:tcPr>
+          <w:p>
+            <w:pPr>
+              <w:rPr>
+                <w:sz w:val="20"/>
+                <w:szCs w:val="20"/>
+              </w:rPr>
+            </w:pPr>
+            <w:r>
+              <w:rPr>
+                <w:b/>
+                <w:sz w:val="20"/>
+                <w:szCs w:val="20"/>
+              </w:rPr>
+              <w:t>Screenplay Format (Sluglines, Action Lines, Character Cues, Dialog)</w:t>
+            </w:r>
+          </w:p>
+        </w:tc>
+        <w:tc>
+          <w:tcPr>
+            <w:tcW w:w="2489" w:type="dxa"/>
+          </w:tcPr>
+          <w:p>
+            <w:pPr>
+              <w:rPr>
+                <w:sz w:val="20"/>
+                <w:szCs w:val="20"/>
+              </w:rPr>
+            </w:pPr>
+            <w:r>
+              <w:rPr>
+                <w:sz w:val="20"/>
+                <w:szCs w:val="20"/>
+              </w:rPr>
+              <w:t>Formatting is largely absent or inconsistent; sluglines, character cues, and dialog blocks are not distinguishable; the script would not translate to a timed film.</w:t>
+            </w:r>
+          </w:p>
+        </w:tc>
+        <w:tc>
+          <w:tcPr>
+            <w:tcW w:w="2430" w:type="dxa"/>
+          </w:tcPr>
+          <w:p>
+            <w:pPr>
+              <w:rPr>
+                <w:sz w:val="20"/>
+                <w:szCs w:val="20"/>
+              </w:rPr>
+            </w:pPr>
+            <w:r>
+              <w:rPr>
+                <w:sz w:val="20"/>
+                <w:szCs w:val="20"/>
+              </w:rPr>
+              <w:t>Some formatting conventions are present but frequently misapplied (e.g., missing INT./EXT., lowercase character cues, prose-style action lines).</w:t>
+            </w:r>
+          </w:p>
+        </w:tc>
+        <w:tc>
+          <w:tcPr>
+            <w:tcW w:w="2430" w:type="dxa"/>
+          </w:tcPr>
+          <w:p>
+            <w:pPr>
+              <w:rPr>
+                <w:sz w:val="20"/>
+                <w:szCs w:val="20"/>
+              </w:rPr>
+            </w:pPr>
+            <w:r>
+              <w:rPr>
+                <w:sz w:val="20"/>
+                <w:szCs w:val="20"/>
+              </w:rPr>
+              <w:t>Most formatting conventions applied correctly; minor lapses in slugline punctuation, parentheticals, or margins; script is readable and mostly filmable.</w:t>
+            </w:r>
+          </w:p>
+        </w:tc>
+        <w:tc>
+          <w:tcPr>
+            <w:tcW w:w="2993" w:type="dxa"/>
+          </w:tcPr>
+          <w:p>
+            <w:pPr>
+              <w:rPr>
+                <w:sz w:val="20"/>
+                <w:szCs w:val="20"/>
+              </w:rPr>
+            </w:pPr>
+            <w:r>
+              <w:rPr>
+                <w:sz w:val="20"/>
+                <w:szCs w:val="20"/>
+              </w:rPr>
+              <w:t>Industry-standard screenplay format throughout: correct sluglines, ALL-CAPS character cues, properly indented dialog, vivid present-tense action lines, 1 page ≈ 1 minute of screen time.</w:t>
+            </w:r>
+          </w:p>
+        </w:tc>
+      </w:tr>
+      <w:tr>
+        <w:trPr>
+          <w:trHeight w:val="1988"/>
+        </w:trPr>
+        <w:tc>
+          <w:tcPr>
+            <w:tcW w:w="1561" w:type="dxa"/>
+          </w:tcPr>
+          <w:p>
+            <w:pPr>
+              <w:rPr>
+                <w:sz w:val="20"/>
+                <w:szCs w:val="20"/>
+              </w:rPr>
+            </w:pPr>
+            <w:r>
+              <w:rPr>
+                <w:b/>
+                <w:sz w:val="20"/>
+                <w:szCs w:val="20"/>
+              </w:rPr>
+              <w:t>Genre Conventions (chosen Film Genre: Action / Horror / Romance / Drama / Comedy)</w:t>
+            </w:r>
+          </w:p>
+        </w:tc>
+        <w:tc>
+          <w:tcPr>
+            <w:tcW w:w="2489" w:type="dxa"/>
+          </w:tcPr>
+          <w:p>
+            <w:pPr>
+              <w:rPr>
+                <w:sz w:val="20"/>
+                <w:szCs w:val="20"/>
+              </w:rPr>
+            </w:pPr>
+            <w:r>
+              <w:rPr>
+                <w:sz w:val="20"/>
+                <w:szCs w:val="20"/>
+              </w:rPr>
+              <w:t>The chosen genre is unclear, or its conventions are missing; the reader cannot identify the tone or audience expectations.</w:t>
+            </w:r>
+          </w:p>
+        </w:tc>
+        <w:tc>
+          <w:tcPr>
+            <w:tcW w:w="2430" w:type="dxa"/>
+          </w:tcPr>
+          <w:p>
+            <w:pPr>
+              <w:rPr>
+                <w:sz w:val="20"/>
+                <w:szCs w:val="20"/>
+              </w:rPr>
+            </w:pPr>
+            <w:r>
+              <w:rPr>
+                <w:sz w:val="20"/>
+                <w:szCs w:val="20"/>
+              </w:rPr>
+              <w:t>Genre is identifiable but conventions are thin, clichéd, or inconsistently applied.</w:t>
+            </w:r>
+          </w:p>
+        </w:tc>
+        <w:tc>
+          <w:tcPr>
+            <w:tcW w:w="2430" w:type="dxa"/>
+          </w:tcPr>
+          <w:p>
+            <w:pPr>
+              <w:rPr>
+                <w:sz w:val="20"/>
+                <w:szCs w:val="20"/>
+              </w:rPr>
+            </w:pPr>
+            <w:r>
+              <w:rPr>
+                <w:sz w:val="20"/>
+                <w:szCs w:val="20"/>
+              </w:rPr>
+              <w:t>Genre conventions are clearly present and mostly consistent; reader experiences expected tone and pacing.</w:t>
+            </w:r>
+          </w:p>
+        </w:tc>
+        <w:tc>
+          <w:tcPr>
+            <w:tcW w:w="2993" w:type="dxa"/>
+          </w:tcPr>
+          <w:p>
+            <w:pPr>
+              <w:rPr>
+                <w:sz w:val="20"/>
+                <w:szCs w:val="20"/>
+              </w:rPr>
+            </w:pPr>
+            <w:r>
+              <w:rPr>
+                <w:sz w:val="20"/>
+                <w:szCs w:val="20"/>
+              </w:rPr>
+              <w:t>Genre conventions are knowingly deployed and, where appropriate, subverted; tone, pacing, and imagery consistently evoke the chosen genre in a way a reader/actor can perform.</w:t>
+            </w:r>
+          </w:p>
+        </w:tc>
+      </w:tr>
+      <w:tr>
+        <w:trPr>
+          <w:trHeight w:val="2024"/>
+        </w:trPr>
+        <w:tc>
+          <w:tcPr>
+            <w:tcW w:w="1561" w:type="dxa"/>
+          </w:tcPr>
+          <w:p>
+            <w:pPr>
+              <w:rPr>
+                <w:sz w:val="20"/>
+                <w:szCs w:val="20"/>
+              </w:rPr>
+            </w:pPr>
+            <w:r>
+              <w:rPr>
+                <w:b/>
+                <w:sz w:val="20"/>
+                <w:szCs w:val="20"/>
+              </w:rPr>
+              <w:t>Use of a Sub-genre Technique (Dream Sequence, Montage, OR Graphic Match-Cut)</w:t>
+            </w:r>
+          </w:p>
+        </w:tc>
+        <w:tc>
+          <w:tcPr>
+            <w:tcW w:w="2489" w:type="dxa"/>
+          </w:tcPr>
+          <w:p>
+            <w:pPr>
+              <w:rPr>
+                <w:sz w:val="20"/>
+                <w:szCs w:val="20"/>
+              </w:rPr>
+            </w:pPr>
+            <w:r>
+              <w:rPr>
+                <w:sz w:val="20"/>
+                <w:szCs w:val="20"/>
+              </w:rPr>
+              <w:t>No identifiable use of a dream sequence, montage, or graphic match-cut, or attempt is mislabeled/</w:t>
+            </w:r>
+            <w:proofErr w:type="spellStart"/>
+            <w:r>
+              <w:rPr>
+                <w:sz w:val="20"/>
+                <w:szCs w:val="20"/>
+              </w:rPr>
+              <w:t>misformatted</w:t>
+            </w:r>
+            <w:proofErr w:type="spellEnd"/>
+            <w:r>
+              <w:rPr>
+                <w:sz w:val="20"/>
+                <w:szCs w:val="20"/>
+              </w:rPr>
+              <w:t>.</w:t>
+            </w:r>
+          </w:p>
+        </w:tc>
+        <w:tc>
+          <w:tcPr>
+            <w:tcW w:w="2430" w:type="dxa"/>
+          </w:tcPr>
+          <w:p>
+            <w:pPr>
+              <w:rPr>
+                <w:sz w:val="20"/>
+                <w:szCs w:val="20"/>
+              </w:rPr>
+            </w:pPr>
+            <w:r>
+              <w:rPr>
+                <w:sz w:val="20"/>
+                <w:szCs w:val="20"/>
+              </w:rPr>
+              <w:t>Attempts one technique but formatting is unclear (e.g., montage without the BEGIN/END MONTAGE frame, match-cut without MATCH CUT TO:).</w:t>
+            </w:r>
+          </w:p>
+        </w:tc>
+        <w:tc>
+          <w:tcPr>
+            <w:tcW w:w="2430" w:type="dxa"/>
+          </w:tcPr>
+          <w:p>
+            <w:pPr>
+              <w:rPr>
+                <w:sz w:val="20"/>
+                <w:szCs w:val="20"/>
+              </w:rPr>
+            </w:pPr>
+            <w:r>
+              <w:rPr>
+                <w:sz w:val="20"/>
+                <w:szCs w:val="20"/>
+              </w:rPr>
+              <w:t xml:space="preserve">Correctly formats and uses one sub-genre technique; purpose of the technique is readable </w:t>
+            </w:r>
+            <w:proofErr w:type="gramStart"/>
+            <w:r>
+              <w:rPr>
+                <w:sz w:val="20"/>
+                <w:szCs w:val="20"/>
+              </w:rPr>
+              <w:t>in</w:t>
+            </w:r>
+            <w:proofErr w:type="gramEnd"/>
+            <w:r>
+              <w:rPr>
+                <w:sz w:val="20"/>
+                <w:szCs w:val="20"/>
+              </w:rPr>
+              <w:t xml:space="preserve"> the page.</w:t>
+            </w:r>
+          </w:p>
+        </w:tc>
+        <w:tc>
+          <w:tcPr>
+            <w:tcW w:w="2993" w:type="dxa"/>
+          </w:tcPr>
+          <w:p>
+            <w:pPr>
+              <w:rPr>
+                <w:sz w:val="20"/>
+                <w:szCs w:val="20"/>
+              </w:rPr>
+            </w:pPr>
+            <w:r>
+              <w:rPr>
+                <w:sz w:val="20"/>
+                <w:szCs w:val="20"/>
+              </w:rPr>
+              <w:t>Integrates one sub-genre technique with precise formatting AND a clear narrative/emotional purpose that advances the story (not decoration).</w:t>
             </w:r>
           </w:p>
         </w:tc>
@@ -831,318 +1705,255 @@
       <w:tr>
         <w:tc>
           <w:tcPr>
-            <w:tcW w:w="2298" w:type="dxa"/>
+            <w:tcW w:w="1561" w:type="dxa"/>
           </w:tcPr>
           <w:p>
+            <w:pPr>
+              <w:rPr>
+                <w:sz w:val="20"/>
+                <w:szCs w:val="20"/>
+              </w:rPr>
+            </w:pPr>
             <w:r>
               <w:rPr>
                 <w:b/>
-              </w:rPr>
-              <w:t>Screenplay Format (Sluglines, Action Lines, Character Cues, Dialog)</w:t>
+                <w:sz w:val="20"/>
+                <w:szCs w:val="20"/>
+              </w:rPr>
+              <w:t>Story &amp; Character (Action, Dialog, Description)</w:t>
             </w:r>
           </w:p>
         </w:tc>
         <w:tc>
           <w:tcPr>
-            <w:tcW w:w="2663" w:type="dxa"/>
+            <w:tcW w:w="2489" w:type="dxa"/>
           </w:tcPr>
           <w:p>
-            <w:r>
-              <w:t>Formatting is largely absent or inconsistent; sluglines, character cues, and dialog blocks are not distinguishable; the script would not translate to a timed film.</w:t>
+            <w:pPr>
+              <w:rPr>
+                <w:sz w:val="20"/>
+                <w:szCs w:val="20"/>
+              </w:rPr>
+            </w:pPr>
+            <w:r>
+              <w:rPr>
+                <w:sz w:val="20"/>
+                <w:szCs w:val="20"/>
+              </w:rPr>
+              <w:t>No clear protagonist, goal, or conflict; action lines narrate feelings/thoughts instead of observable behavior; dialog is absent or functionally nonexistent.</w:t>
             </w:r>
           </w:p>
         </w:tc>
         <w:tc>
           <w:tcPr>
-            <w:tcW w:w="1879" w:type="dxa"/>
+            <w:tcW w:w="2430" w:type="dxa"/>
           </w:tcPr>
           <w:p>
-            <w:r>
-              <w:t>Some formatting conventions are present but frequently misapplied (e.g., missing INT./EXT., lowercase character cues, prose-style action lines).</w:t>
+            <w:pPr>
+              <w:rPr>
+                <w:sz w:val="20"/>
+                <w:szCs w:val="20"/>
+              </w:rPr>
+            </w:pPr>
+            <w:r>
+              <w:rPr>
+                <w:sz w:val="20"/>
+                <w:szCs w:val="20"/>
+              </w:rPr>
+              <w:t xml:space="preserve">A protagonist and situation are </w:t>
+            </w:r>
+            <w:proofErr w:type="gramStart"/>
+            <w:r>
+              <w:rPr>
+                <w:sz w:val="20"/>
+                <w:szCs w:val="20"/>
+              </w:rPr>
+              <w:t>present</w:t>
+            </w:r>
+            <w:proofErr w:type="gramEnd"/>
+            <w:r>
+              <w:rPr>
+                <w:sz w:val="20"/>
+                <w:szCs w:val="20"/>
+              </w:rPr>
+              <w:t xml:space="preserve"> but goal or conflict is fuzzy; dialog is stilted or on-the-nose; action lines sometimes describe un-filmable interiority.</w:t>
             </w:r>
           </w:p>
         </w:tc>
         <w:tc>
           <w:tcPr>
-            <w:tcW w:w="2160" w:type="dxa"/>
+            <w:tcW w:w="2430" w:type="dxa"/>
           </w:tcPr>
           <w:p>
-            <w:r>
-              <w:t>Most formatting conventions applied correctly; minor lapses in slugline punctuation, parentheticals, or margins; script is readable and mostly filmable.</w:t>
+            <w:pPr>
+              <w:rPr>
+                <w:sz w:val="20"/>
+                <w:szCs w:val="20"/>
+              </w:rPr>
+            </w:pPr>
+            <w:r>
+              <w:rPr>
+                <w:sz w:val="20"/>
+                <w:szCs w:val="20"/>
+              </w:rPr>
+              <w:t>Clear protagonist with a goal, an obstacle, and a change across 3 pages; action describes what the camera can see; dialog mostly sounds like spoken language.</w:t>
             </w:r>
           </w:p>
         </w:tc>
         <w:tc>
           <w:tcPr>
-            <w:tcW w:w="2700" w:type="dxa"/>
+            <w:tcW w:w="2993" w:type="dxa"/>
           </w:tcPr>
           <w:p>
-            <w:r>
-              <w:t>Industry-standard screenplay format throughout: correct sluglines, ALL-CAPS character cues, properly indented dialog, vivid present-tense action lines, 1 page ≈ 1 minute of screen time.</w:t>
+            <w:pPr>
+              <w:rPr>
+                <w:sz w:val="20"/>
+                <w:szCs w:val="20"/>
+              </w:rPr>
+            </w:pPr>
+            <w:r>
+              <w:rPr>
+                <w:sz w:val="20"/>
+                <w:szCs w:val="20"/>
+              </w:rPr>
+              <w:t>Compelling, specific protagonist with a clear goal, escalating conflict, and earned turn/resolution; lean action description in present tense shows only what is on-screen; dialog reveals character and subtext.</w:t>
             </w:r>
           </w:p>
         </w:tc>
       </w:tr>
       <w:tr>
+        <w:trPr>
+          <w:trHeight w:val="1826"/>
+        </w:trPr>
         <w:tc>
           <w:tcPr>
-            <w:tcW w:w="2298" w:type="dxa"/>
+            <w:tcW w:w="1561" w:type="dxa"/>
           </w:tcPr>
           <w:p>
+            <w:pPr>
+              <w:rPr>
+                <w:sz w:val="20"/>
+                <w:szCs w:val="20"/>
+              </w:rPr>
+            </w:pPr>
             <w:r>
               <w:rPr>
                 <w:b/>
-              </w:rPr>
-              <w:t>Genre Conventions (chosen Film Genre: Action / Horror / Romance / Drama / Comedy)</w:t>
+                <w:sz w:val="20"/>
+                <w:szCs w:val="20"/>
+              </w:rPr>
+              <w:t>Revision, Table Read, &amp; Professionalism</w:t>
             </w:r>
           </w:p>
         </w:tc>
         <w:tc>
           <w:tcPr>
-            <w:tcW w:w="2663" w:type="dxa"/>
+            <w:tcW w:w="2489" w:type="dxa"/>
           </w:tcPr>
           <w:p>
-            <w:r>
-              <w:t>The chosen genre is unclear, or its conventions are missing; the reader cannot identify the tone or audience expectations.</w:t>
+            <w:pPr>
+              <w:rPr>
+                <w:sz w:val="20"/>
+                <w:szCs w:val="20"/>
+              </w:rPr>
+            </w:pPr>
+            <w:r>
+              <w:rPr>
+                <w:sz w:val="20"/>
+                <w:szCs w:val="20"/>
+              </w:rPr>
+              <w:t xml:space="preserve">No evidence of revision; </w:t>
+            </w:r>
+            <w:proofErr w:type="gramStart"/>
+            <w:r>
+              <w:rPr>
+                <w:sz w:val="20"/>
+                <w:szCs w:val="20"/>
+              </w:rPr>
+              <w:t>student</w:t>
+            </w:r>
+            <w:proofErr w:type="gramEnd"/>
+            <w:r>
+              <w:rPr>
+                <w:sz w:val="20"/>
+                <w:szCs w:val="20"/>
+              </w:rPr>
+              <w:t xml:space="preserve"> did not participate in table read; final script is late, incomplete, or not the correct length.</w:t>
             </w:r>
           </w:p>
         </w:tc>
         <w:tc>
           <w:tcPr>
-            <w:tcW w:w="1879" w:type="dxa"/>
+            <w:tcW w:w="2430" w:type="dxa"/>
           </w:tcPr>
           <w:p>
-            <w:r>
-              <w:t>Genre is identifiable but conventions are thin, clichéd, or inconsistently applied.</w:t>
+            <w:pPr>
+              <w:rPr>
+                <w:sz w:val="20"/>
+                <w:szCs w:val="20"/>
+              </w:rPr>
+            </w:pPr>
+            <w:r>
+              <w:rPr>
+                <w:sz w:val="20"/>
+                <w:szCs w:val="20"/>
+              </w:rPr>
+              <w:t>Minor revisions between draft and final; participated passively in table read; script is close to 3 pages but under/over with little reason.</w:t>
             </w:r>
           </w:p>
         </w:tc>
         <w:tc>
           <w:tcPr>
-            <w:tcW w:w="2160" w:type="dxa"/>
+            <w:tcW w:w="2430" w:type="dxa"/>
           </w:tcPr>
           <w:p>
-            <w:r>
-              <w:t>Genre conventions are clearly present and mostly consistent; reader experiences expected tone and pacing.</w:t>
+            <w:pPr>
+              <w:rPr>
+                <w:sz w:val="20"/>
+                <w:szCs w:val="20"/>
+              </w:rPr>
+            </w:pPr>
+            <w:r>
+              <w:rPr>
+                <w:sz w:val="20"/>
+                <w:szCs w:val="20"/>
+              </w:rPr>
+              <w:t>Visible revision in response to table-read feedback; actively participated as reader and/or listener; script is ~3 pages (≈ 3 minutes).</w:t>
             </w:r>
           </w:p>
         </w:tc>
         <w:tc>
           <w:tcPr>
-            <w:tcW w:w="2700" w:type="dxa"/>
+            <w:tcW w:w="2993" w:type="dxa"/>
           </w:tcPr>
           <w:p>
-            <w:r>
-              <w:t>Genre conventions are knowingly deployed and, where appropriate, subverted; tone, pacing, and imagery consistently evoke the chosen genre in a way a reader/actor can perform.</w:t>
-            </w:r>
-          </w:p>
-        </w:tc>
-      </w:tr>
-      <w:tr>
-        <w:tc>
-          <w:tcPr>
-            <w:tcW w:w="2298" w:type="dxa"/>
-          </w:tcPr>
-          <w:p>
-            <w:r>
-              <w:rPr>
-                <w:b/>
-              </w:rPr>
-              <w:t>Use of a Sub-genre Technique (Dream Sequence, Montage, OR Graphic Match-Cut)</w:t>
-            </w:r>
-          </w:p>
-        </w:tc>
-        <w:tc>
-          <w:tcPr>
-            <w:tcW w:w="2663" w:type="dxa"/>
-          </w:tcPr>
-          <w:p>
-            <w:r>
-              <w:t>No identifiable use of a dream sequence, montage, or graphic match-cut, or attempt is mislabeled/</w:t>
-            </w:r>
-            <w:proofErr w:type="spellStart"/>
-            <w:r>
-              <w:t>misformatted</w:t>
-            </w:r>
-            <w:proofErr w:type="spellEnd"/>
-            <w:r>
-              <w:t>.</w:t>
-            </w:r>
-          </w:p>
-        </w:tc>
-        <w:tc>
-          <w:tcPr>
-            <w:tcW w:w="1879" w:type="dxa"/>
-          </w:tcPr>
-          <w:p>
-            <w:r>
-              <w:t>Attempts one technique but formatting is unclear (e.g., montage without the BEGIN/END MONTAGE frame, match-cut without MATCH CUT TO:).</w:t>
-            </w:r>
-          </w:p>
-        </w:tc>
-        <w:tc>
-          <w:tcPr>
-            <w:tcW w:w="2160" w:type="dxa"/>
-          </w:tcPr>
-          <w:p>
-            <w:r>
-              <w:t xml:space="preserve">Correctly formats and uses one sub-genre technique; purpose of the technique is readable </w:t>
+            <w:pPr>
+              <w:rPr>
+                <w:sz w:val="20"/>
+                <w:szCs w:val="20"/>
+              </w:rPr>
+            </w:pPr>
+            <w:r>
+              <w:rPr>
+                <w:sz w:val="20"/>
+                <w:szCs w:val="20"/>
+              </w:rPr>
+              <w:t xml:space="preserve">Substantive revision in response to table-read feedback is visible on the page (changed lines, tightened action); </w:t>
             </w:r>
             <w:proofErr w:type="gramStart"/>
             <w:r>
-              <w:t>in</w:t>
+              <w:rPr>
+                <w:sz w:val="20"/>
+                <w:szCs w:val="20"/>
+              </w:rPr>
+              <w:t>led</w:t>
             </w:r>
             <w:proofErr w:type="gramEnd"/>
             <w:r>
-              <w:t xml:space="preserve"> the page.</w:t>
-            </w:r>
-          </w:p>
-        </w:tc>
-        <w:tc>
-          <w:tcPr>
-            <w:tcW w:w="2700" w:type="dxa"/>
-          </w:tcPr>
-          <w:p>
-            <w:r>
-              <w:t>Integrates one sub-genre technique with precise formatting AND a clear narrative/emotional purpose that advances the story (not decoration).</w:t>
-            </w:r>
-          </w:p>
-        </w:tc>
-      </w:tr>
-      <w:tr>
-        <w:tc>
-          <w:tcPr>
-            <w:tcW w:w="2298" w:type="dxa"/>
-          </w:tcPr>
-          <w:p>
-            <w:r>
-              <w:rPr>
-                <w:b/>
-              </w:rPr>
-              <w:t>Story &amp; Character (Action, Dialog, Description)</w:t>
-            </w:r>
-          </w:p>
-        </w:tc>
-        <w:tc>
-          <w:tcPr>
-            <w:tcW w:w="2663" w:type="dxa"/>
-          </w:tcPr>
-          <w:p>
-            <w:r>
-              <w:t>No clear protagonist, goal, or conflict; action lines narrate feelings/thoughts instead of observable behavior; dialog is absent or functionally nonexistent.</w:t>
-            </w:r>
-          </w:p>
-        </w:tc>
-        <w:tc>
-          <w:tcPr>
-            <w:tcW w:w="1879" w:type="dxa"/>
-          </w:tcPr>
-          <w:p>
-            <w:r>
-              <w:t xml:space="preserve">A protagonist and situation are </w:t>
-            </w:r>
-            <w:proofErr w:type="gramStart"/>
-            <w:r>
-              <w:t>present</w:t>
-            </w:r>
-            <w:proofErr w:type="gramEnd"/>
-            <w:r>
-              <w:t xml:space="preserve"> but goal or conflict is fuzzy; dialog is stilted or on-the-nose; action lines sometimes describe un-</w:t>
-            </w:r>
-            <w:r>
-              <w:lastRenderedPageBreak/>
-              <w:t>filmable interiority.</w:t>
-            </w:r>
-          </w:p>
-        </w:tc>
-        <w:tc>
-          <w:tcPr>
-            <w:tcW w:w="2160" w:type="dxa"/>
-          </w:tcPr>
-          <w:p>
-            <w:r>
-              <w:lastRenderedPageBreak/>
-              <w:t>Clear protagonist with a goal, an obstacle, and a change across 3 pages; action describes what the camera can see; dialog mostly sounds like spoken language.</w:t>
-            </w:r>
-          </w:p>
-        </w:tc>
-        <w:tc>
-          <w:tcPr>
-            <w:tcW w:w="2700" w:type="dxa"/>
-          </w:tcPr>
-          <w:p>
-            <w:r>
-              <w:t>Compelling, specific protagonist with a clear goal, escalating conflict, and earned turn/resolution; lean action description in present tense shows only what is on-screen; dialog reveals character and subtext.</w:t>
-            </w:r>
-          </w:p>
-        </w:tc>
-      </w:tr>
-      <w:tr>
-        <w:tc>
-          <w:tcPr>
-            <w:tcW w:w="2298" w:type="dxa"/>
-          </w:tcPr>
-          <w:p>
-            <w:r>
-              <w:rPr>
-                <w:b/>
-              </w:rPr>
-              <w:t>Revision, Table Read, &amp; Professionalism</w:t>
-            </w:r>
-          </w:p>
-        </w:tc>
-        <w:tc>
-          <w:tcPr>
-            <w:tcW w:w="2663" w:type="dxa"/>
-          </w:tcPr>
-          <w:p>
-            <w:r>
-              <w:t xml:space="preserve">No evidence of revision; </w:t>
-            </w:r>
-            <w:proofErr w:type="gramStart"/>
-            <w:r>
-              <w:t>student</w:t>
-            </w:r>
-            <w:proofErr w:type="gramEnd"/>
-            <w:r>
-              <w:t xml:space="preserve"> did not participate in table read; final script is late, incomplete, or not the correct length.</w:t>
-            </w:r>
-          </w:p>
-        </w:tc>
-        <w:tc>
-          <w:tcPr>
-            <w:tcW w:w="1879" w:type="dxa"/>
-          </w:tcPr>
-          <w:p>
-            <w:r>
-              <w:t>Minor revisions between draft and final; participated passively in table read; script is close to 3 pages but under/over with little reason.</w:t>
-            </w:r>
-          </w:p>
-        </w:tc>
-        <w:tc>
-          <w:tcPr>
-            <w:tcW w:w="2160" w:type="dxa"/>
-          </w:tcPr>
-          <w:p>
-            <w:r>
-              <w:t>Visible revision in response to table-read feedback; actively participated as reader and/or listener; script is ~3 pages (≈ 3 minutes).</w:t>
-            </w:r>
-          </w:p>
-        </w:tc>
-        <w:tc>
-          <w:tcPr>
-            <w:tcW w:w="2700" w:type="dxa"/>
-          </w:tcPr>
-          <w:p>
-            <w:r>
-              <w:t xml:space="preserve">Substantive revision in response to table-read feedback is visible on the page (changed lines, tightened action); </w:t>
-            </w:r>
-            <w:proofErr w:type="gramStart"/>
-            <w:r>
-              <w:t>led</w:t>
-            </w:r>
-            <w:proofErr w:type="gramEnd"/>
-            <w:r>
+              <w:rPr>
+                <w:sz w:val="20"/>
+                <w:szCs w:val="20"/>
+              </w:rPr>
               <w:t xml:space="preserve"> a strong, voiced table read; final script is a polished 3 pages (≈ 3 minutes).</w:t>
             </w:r>
           </w:p>
@@ -1165,7 +1976,7 @@
   <w:abstractNum w:abstractNumId="0" w15:restartNumberingAfterBreak="0">
     <w:nsid w:val="FFFFFF88"/>
     <w:multiLevelType w:val="singleLevel"/>
-    <w:tmpl w:val="1B7CC784"/>
+    <w:tmpl w:val="E0523D7C"/>
     <w:lvl w:ilvl="0">
       <w:start w:val="1"/>
       <w:numFmt w:val="decimal"/>
@@ -1183,7 +1994,7 @@
   <w:abstractNum w:abstractNumId="1" w15:restartNumberingAfterBreak="0">
     <w:nsid w:val="FFFFFF89"/>
     <w:multiLevelType w:val="singleLevel"/>
-    <w:tmpl w:val="C8F02762"/>
+    <w:tmpl w:val="E0FA8678"/>
     <w:lvl w:ilvl="0">
       <w:start w:val="1"/>
       <w:numFmt w:val="bullet"/>
@@ -1205,6 +2016,12 @@
     <w:abstractNumId w:val="1"/>
   </w:num>
   <w:num w:numId="2" w16cid:durableId="1517504581">
+    <w:abstractNumId w:val="0"/>
+  </w:num>
+  <w:num w:numId="3" w16cid:durableId="1441872818">
+    <w:abstractNumId w:val="0"/>
+  </w:num>
+  <w:num w:numId="4" w16cid:durableId="71894749">
     <w:abstractNumId w:val="0"/>
   </w:num>
 </w:numbering>

</xml_diff>